<commit_message>
Figure 1: redraw at text width with larger type, heavier lines and 300 dpi; rebuild v22 DOCX
Co-Authored-By: Claude Fable 5.1 <noreply@anthropic.com>
Claude-Session: https://claude.ai/code/session_01SvckvZxt3hAXTDPnm8YPEC
</commit_message>
<xml_diff>
--- a/journal/manuscript_v22_ko.docx
+++ b/journal/manuscript_v22_ko.docx
@@ -474,7 +474,7 @@
       <w:r>
         <w:drawing>
           <wp:inline>
-            <wp:extent cx="5334000" cy="3710608"/>
+            <wp:extent cx="5334000" cy="4233333"/>
             <wp:effectExtent b="0" l="0" r="0" t="0"/>
             <wp:docPr descr="" title="" id="18" name="Picture"/>
             <a:graphic>
@@ -495,7 +495,7 @@
                   <pic:spPr bwMode="auto">
                     <a:xfrm>
                       <a:off x="0" y="0"/>
-                      <a:ext cx="5334000" cy="3710608"/>
+                      <a:ext cx="5334000" cy="4233333"/>
                     </a:xfrm>
                     <a:prstGeom prst="rect">
                       <a:avLst/>

</xml_diff>

<commit_message>
Figure 4: redraw at text width with larger type, thicker lines and 300 dpi (tools/make_fig_pred_types.py)
Co-Authored-By: Claude Fable 5.1 <noreply@anthropic.com>
Claude-Session: https://claude.ai/code/session_01SvckvZxt3hAXTDPnm8YPEC
</commit_message>
<xml_diff>
--- a/journal/manuscript_v22_ko.docx
+++ b/journal/manuscript_v22_ko.docx
@@ -5939,7 +5939,7 @@
       <w:r>
         <w:drawing>
           <wp:inline>
-            <wp:extent cx="5334000" cy="2133599"/>
+            <wp:extent cx="5334000" cy="2794000"/>
             <wp:effectExtent b="0" l="0" r="0" t="0"/>
             <wp:docPr descr="" title="" id="35" name="Picture"/>
             <a:graphic>
@@ -5960,7 +5960,7 @@
                   <pic:spPr bwMode="auto">
                     <a:xfrm>
                       <a:off x="0" y="0"/>
-                      <a:ext cx="5334000" cy="2133599"/>
+                      <a:ext cx="5334000" cy="2794000"/>
                     </a:xfrm>
                     <a:prstGeom prst="rect">
                       <a:avLst/>

</xml_diff>

<commit_message>
Figures 2-7: common specification (text width 6.3 in, 11 pt type, thicker marks, 300 dpi); rebuild v22 DOCX
Co-Authored-By: Claude Fable 5.1 <noreply@anthropic.com>
Claude-Session: https://claude.ai/code/session_01SvckvZxt3hAXTDPnm8YPEC
</commit_message>
<xml_diff>
--- a/journal/manuscript_v22_ko.docx
+++ b/journal/manuscript_v22_ko.docx
@@ -2295,7 +2295,7 @@
       <w:r>
         <w:drawing>
           <wp:inline>
-            <wp:extent cx="5334000" cy="2844799"/>
+            <wp:extent cx="5334000" cy="3048000"/>
             <wp:effectExtent b="0" l="0" r="0" t="0"/>
             <wp:docPr descr="" title="" id="24" name="Picture"/>
             <a:graphic>
@@ -2316,7 +2316,7 @@
                   <pic:spPr bwMode="auto">
                     <a:xfrm>
                       <a:off x="0" y="0"/>
-                      <a:ext cx="5334000" cy="2844799"/>
+                      <a:ext cx="5334000" cy="3048000"/>
                     </a:xfrm>
                     <a:prstGeom prst="rect">
                       <a:avLst/>
@@ -8164,7 +8164,7 @@
       <w:r>
         <w:drawing>
           <wp:inline>
-            <wp:extent cx="5334000" cy="3200400"/>
+            <wp:extent cx="5334000" cy="3386666"/>
             <wp:effectExtent b="0" l="0" r="0" t="0"/>
             <wp:docPr descr="" title="" id="41" name="Picture"/>
             <a:graphic>
@@ -8185,7 +8185,7 @@
                   <pic:spPr bwMode="auto">
                     <a:xfrm>
                       <a:off x="0" y="0"/>
-                      <a:ext cx="5334000" cy="3200400"/>
+                      <a:ext cx="5334000" cy="3386666"/>
                     </a:xfrm>
                     <a:prstGeom prst="rect">
                       <a:avLst/>

</xml_diff>